<commit_message>
Restore the two paragraphs missing from the source PDF (Week 8 direction-pin bug, Week 9 heading lock)
Wording taken from Alex's matching reports.

Co-Authored-By: Claude Sonnet 5.5 <noreply@anthropic.com>
</commit_message>
<xml_diff>
--- a/docs/Giang_weekly_reports/Week_08_Report.docx
+++ b/docs/Giang_weekly_reports/Week_08_Report.docx
@@ -1210,6 +1210,18 @@
                 <w:b w:val="0"/>
                 <w:sz w:val="20"/>
               </w:rPr>
+              <w:t>First: one wheel's direction pins were only ever set once at boot to "forward" and never updated again, so any turn that needed that wheel to reverse just left it stalled at zero instead of actually spinning backward. It looked exactly like a motor too weak to turn the robot, when really the wheel was just stuck facing the wrong way.</w:t>
+            </w:r>
+          </w:p>
+          <w:p>
+            <w:pPr>
+              <w:spacing w:after="60"/>
+            </w:pPr>
+            <w:r>
+              <w:rPr>
+                <w:b w:val="0"/>
+                <w:sz w:val="20"/>
+              </w:rPr>
               <w:t>Second, once that was fixed: PWM output still plateaued well below its max. That turned out to be the mission's own conservative speed caps combined with a small hardcoded limit on the PID's integral term, which capped the loop's output before it could out-power the motor's load. Fixed the direction-pin bug in firmware, raised the speed caps, and made the PID's gains and integral limit live-tunable from the dashboard instead of fixed in firmware, so tuning no longer requires a full reflash each time.</w:t>
             </w:r>
           </w:p>

</xml_diff>